<commit_message>
Fill delivery commit reference and close RA1 checklist
Closes the pending template fields except student IDs, which the group
will add when RA2 is finished and both are delivered together.
</commit_message>
<xml_diff>
--- a/docs/RA1_Data_Analytics.docx
+++ b/docs/RA1_Data_Analytics.docx
@@ -6826,7 +6826,7 @@
       </w:r>
       <w:r>
         <w:rPr/>
-        <w:t>https://github.com/LucasStop/pjbl-steam-analytics • branch master • commit da entrega: [definir após o commit final]</w:t>
+        <w:t>https://github.com/LucasStop/pjbl-steam-analytics • branch master • commit do código da entrega: 52a93ee (o documento recebeu correções em commits posteriores)</w:t>
       </w:r>
     </w:p>
     <w:p>
@@ -7912,7 +7912,7 @@
     </w:p>
     <w:p>
       <w:r>
-        <w:t>☐  Os campos-modelo foram preenchidos e os exemplos revisados.</w:t>
+        <w:t>☒  Os campos-modelo foram preenchidos e os exemplos revisados.</w:t>
       </w:r>
     </w:p>
     <w:sectPr>

</xml_diff>